<commit_message>
Cierre: Auth, Fase 5
</commit_message>
<xml_diff>
--- a/documentacion/reglas_negocio/Reglas_de_Negocio_HwangHon_v1_0.docx
+++ b/documentacion/reglas_negocio/Reglas_de_Negocio_HwangHon_v1_0.docx
@@ -489,7 +489,7 @@
           <w:color w:val="000000"/>
           <w:sz w:val="20"/>
         </w:rPr>
-        <w:t>Fuente: Documento Maestro (v0.2.5); Bitácora Académica; registro de dominio del proyecto (topics/dominio-hwanghon.md); rondas de revisión hasta el 15/10/2026; Plan de Acción IMRDS 2026 (fuente primaria); consulta directa con Viviana González Sánchez (secretaria) y con Aldrin Díaz Herrera; validación directa de John (23/09/2026).</w:t>
+        <w:t>Fuente: Documento Maestro (v0.2.6); Bitácora Académica; registro de dominio del proyecto (topics/dominio-hwanghon.md); rondas de revisión hasta el 15/10/2026; Plan de Acción IMRDS 2026 (fuente primaria); consulta directa con Viviana González Sánchez (secretaria) y con Aldrin Díaz Herrera; validación directa de John (23/09/2026).</w:t>
       </w:r>
     </w:p>
     <w:p>
@@ -6369,6 +6369,19 @@
     </w:p>
     <w:p>
       <w:pPr>
+        <w:spacing w:after="160"/>
+      </w:pPr>
+      <w:r>
+        <w:rPr>
+          <w:rFonts w:ascii="Arial" w:hAnsi="Arial"/>
+          <w:color w:val="000000"/>
+          <w:sz w:val="24"/>
+        </w:rPr>
+        <w:t>Entre dos solicitudes de recuperación para el mismo correo debe pasar un mínimo de 5 minutos. La respuesta que ve el usuario es la misma exista o no una cuenta con ese correo, para no revelar qué correos están registrados.</w:t>
+      </w:r>
+    </w:p>
+    <w:p>
+      <w:pPr>
         <w:spacing w:before="200" w:after="60"/>
       </w:pPr>
       <w:r>
@@ -6512,7 +6525,7 @@
           <w:color w:val="000000"/>
           <w:sz w:val="24"/>
         </w:rPr>
-        <w:t>El acceso final de la cuenta creada por autorregistro queda restringido a los mismos campos editables de cualquier cuenta pública: peso y discapacidad / condición de salud (RN-1.4).</w:t>
+        <w:t>El acceso final de la cuenta creada por autorregistro queda restringido a los mismos campos editables de cualquier cuenta pública: peso, discapacidad/condición de salud, teléfono, dirección y correo, y la confirmación de la entrega de su propio cinturón cuando corresponda (RN-1.4, RN-T.3, RN-5.7).</w:t>
       </w:r>
     </w:p>
     <w:p>
@@ -6774,7 +6787,7 @@
           <w:color w:val="000000"/>
           <w:sz w:val="24"/>
         </w:rPr>
-        <w:t>La contraseña debe tener un mínimo de 8 caracteres. Quien ya inició sesión tiene una acción «cambiar mi contraseña», que le pide la contraseña actual antes de permitir la nueva.</w:t>
+        <w:t>La contraseña debe tener un mínimo de 8 caracteres y un máximo de 72 bytes (límite de bcrypt). Quien ya inició sesión tiene una acción «cambiar mi contraseña», que le pide la contraseña actual antes de permitir la nueva.</w:t>
       </w:r>
     </w:p>
     <w:p>

</xml_diff>